<commit_message>
docs: integrate customer and market strategy into overall planning
</commit_message>
<xml_diff>
--- a/docs/13출시·마케팅/HELL_DIROI_종합확장전략기획서_v2_0.docx
+++ b/docs/13출시·마케팅/HELL_DIROI_종합확장전략기획서_v2_0.docx
@@ -217,7 +217,7 @@
           <w:sz w:val="24"/>
           <w:szCs w:val="24"/>
         </w:rPr>
-        <w:t xml:space="preserve">4. 시장 분석 - 인디 ARPG 벤치마크 (Dead Cells, Hades, Hollow Knight)</w:t>
+        <w:t>4. 시장 분석과 핵심 고객 전략</w:t>
       </w:r>
     </w:p>
     <w:p>
@@ -382,7 +382,7 @@
           <w:sz w:val="22"/>
           <w:szCs w:val="22"/>
         </w:rPr>
-        <w:t xml:space="preserve">HELL은 1인 개발 인디 ARPG의 글로벌 진출 표준 경로(Dead Cells, Hollow Knight, Salt and Sanctuary)를 따르며, Steam 얼리액세스 + 멀티스토어 + 콘솔 이식 + 한국 정부 지원사업 다층 자금 채널로 안정적 출시를 도모한다.</w:t>
+        <w:t>EXODUSER는 장르 경험과 유료 게임 구매 의향이 있는 글로벌 성인 핵앤슬래시 고객을 우선 확보한다. 디아블로·PoE·라스트 에폭의 시즌 사이 공백을 진입 기회로 삼고, 던전 시즈·라스트 에폭의 포지션을 참고한다. 루팅·빌드의 깊이와 패링·기동 액션, 세계관·스토리로 독자적 브랜드를 구축하며 인접 ARPG 고객층까지 확장한다.</w:t>
       </w:r>
     </w:p>
     <w:p>
@@ -1612,7 +1612,7 @@
                 <w:sz w:val="22"/>
                 <w:szCs w:val="22"/>
               </w:rPr>
-              <w:t xml:space="preserve">포지셔닝: 7챕터 선형 진행 + 폭로 서사 (검은신화 오공형 보스 사연 누적)</w:t>
+              <w:t>포지셔닝: 글로벌 핵앤슬래시 핵심 고객 확보 → 독자 브랜드 정착 → 인접 ARPG 확장. 던전 시즈·라스트 에폭의 장르 내 포지션 참고</w:t>
             </w:r>
           </w:p>
           <w:p>
@@ -1648,7 +1648,7 @@
                 <w:sz w:val="22"/>
                 <w:szCs w:val="22"/>
               </w:rPr>
-              <w:t xml:space="preserve">타겟 시장: 한국 · 일본 · 미국 · 유럽 1차, 중국 · 동남아 2차</w:t>
+              <w:t>타겟 고객: 글로벌 PC 핵앤슬래시 유저 중 장르 경험과 유료 게임 구매 의향이 있는 성인층. 국가·언어별 검증을 거쳐 확장</w:t>
             </w:r>
           </w:p>
         </w:tc>
@@ -2970,1313 +2970,485 @@
     <w:p>
       <w:pPr>
         <w:pStyle w:val="Heading1"/>
-        <w:spacing w:after="200" w:before="360"/>
+        <w:keepNext/>
+        <w:pageBreakBefore/>
+        <w:spacing w:after="160" w:line="300" w:lineRule="auto"/>
       </w:pPr>
       <w:r>
         <w:rPr>
+          <w:rFonts w:ascii="Malgun Gothic" w:hAnsi="Malgun Gothic" w:eastAsia="맑은 고딕"/>
           <w:b/>
-          <w:bCs/>
-          <w:color w:val="1A1A1A"/>
-          <w:sz w:val="36"/>
-          <w:szCs w:val="36"/>
+          <w:color w:val="000000"/>
+          <w:sz w:val="32"/>
         </w:rPr>
-        <w:t xml:space="preserve">4. 시장 분석 - 인디 ARPG 벤치마크</w:t>
+        <w:t>4 시장 분석과 핵심 고객 전략</w:t>
       </w:r>
     </w:p>
     <w:p>
       <w:pPr>
-        <w:spacing w:after="120"/>
+        <w:keepNext w:val="0"/>
+        <w:pageBreakBefore w:val="0"/>
+        <w:spacing w:after="160" w:line="300" w:lineRule="auto"/>
       </w:pPr>
       <w:r>
         <w:rPr>
-          <w:sz w:val="22"/>
-          <w:szCs w:val="22"/>
+          <w:rFonts w:ascii="Malgun Gothic" w:hAnsi="Malgun Gothic" w:eastAsia="맑은 고딕"/>
+          <w:b w:val="0"/>
+          <w:color w:val="000000"/>
+          <w:sz w:val="21"/>
         </w:rPr>
-        <w:t xml:space="preserve">HELL EXODUSER는 인디 ARPG 시장에서 Dead Cells, Hollow Knight, Salt and Sanctuary, Hades 등의 글로벌 성공 사례를 벤치마크로 삼는다.</w:t>
+        <w:t>2026-09-30 고객·제품·사업 전략 갱신. 이 절은 목표 고객과 제작·사업 판단의 현행 기준이다. 다른 절의 예전 가격·일정·시장 추정·기술 계획을 현재 확정안이나 구현 완료로 재확인한 것은 아니다.</w:t>
       </w:r>
     </w:p>
     <w:p>
       <w:pPr>
         <w:pStyle w:val="Heading2"/>
-        <w:spacing w:after="160" w:before="280"/>
+        <w:keepNext/>
+        <w:pageBreakBefore w:val="0"/>
+        <w:spacing w:after="160" w:line="300" w:lineRule="auto"/>
       </w:pPr>
       <w:r>
         <w:rPr>
+          <w:rFonts w:ascii="Malgun Gothic" w:hAnsi="Malgun Gothic" w:eastAsia="맑은 고딕"/>
           <w:b/>
-          <w:bCs/>
-          <w:color w:val="2A2A2A"/>
-          <w:sz w:val="28"/>
-          <w:szCs w:val="28"/>
+          <w:color w:val="000000"/>
+          <w:sz w:val="24"/>
         </w:rPr>
-        <w:t xml:space="preserve">4.1 인디 ARPG 시장 성공 사례</w:t>
+        <w:t>4.1 EXODUSER 고객과 시장 진입</w:t>
+      </w:r>
+    </w:p>
+    <w:p>
+      <w:pPr>
+        <w:keepNext w:val="0"/>
+        <w:pageBreakBefore w:val="0"/>
+        <w:spacing w:after="160" w:line="300" w:lineRule="auto"/>
+      </w:pPr>
+      <w:r>
+        <w:rPr>
+          <w:rFonts w:ascii="Malgun Gothic" w:hAnsi="Malgun Gothic" w:eastAsia="맑은 고딕"/>
+          <w:b w:val="0"/>
+          <w:color w:val="000000"/>
+          <w:sz w:val="21"/>
+        </w:rPr>
+        <w:t>EXODUSER는 장르 경험과 유료 게임 구매 의향이 있는 글로벌 성인 핵앤슬래시 고객을 우선 확보한다. 디아블로·PoE·라스트 에폭의 시즌 사이 공백을 진입 기회로 삼고, 던전 시즈·라스트 에폭의 포지션을 참고한다. 루팅·빌드의 깊이와 패링·기동 액션, 세계관·스토리로 독자적 브랜드를 구축하며 인접 ARPG 고객층까지 확장한다.</w:t>
       </w:r>
     </w:p>
     <w:tbl>
       <w:tblPr>
-        <w:tblW w:type="dxa" w:w="9360"/>
+        <w:tblW w:type="auto" w:w="0"/>
+        <w:tblLayout w:type="fixed"/>
+        <w:tblLook w:firstColumn="1" w:firstRow="1" w:lastColumn="0" w:lastRow="0" w:noHBand="0" w:noVBand="1" w:val="04A0"/>
         <w:tblBorders>
-          <w:top w:val="single" w:color="auto" w:sz="4"/>
-          <w:left w:val="single" w:color="auto" w:sz="4"/>
-          <w:bottom w:val="single" w:color="auto" w:sz="4"/>
-          <w:right w:val="single" w:color="auto" w:sz="4"/>
-          <w:insideH w:val="single" w:color="auto" w:sz="4"/>
-          <w:insideV w:val="single" w:color="auto" w:sz="4"/>
+          <w:top w:val="single" w:sz="4" w:color="D9D9D9"/>
+          <w:left w:val="single" w:sz="4" w:color="D9D9D9"/>
+          <w:bottom w:val="single" w:sz="4" w:color="D9D9D9"/>
+          <w:right w:val="single" w:sz="4" w:color="D9D9D9"/>
+          <w:insideH w:val="single" w:sz="4" w:color="D9D9D9"/>
+          <w:insideV w:val="single" w:sz="4" w:color="D9D9D9"/>
         </w:tblBorders>
       </w:tblPr>
       <w:tblGrid>
-        <w:gridCol w:w="1900"/>
-        <w:gridCol w:w="2200"/>
-        <w:gridCol w:w="1200"/>
-        <w:gridCol w:w="1900"/>
-        <w:gridCol w:w="2160"/>
+        <w:gridCol w:w="1656"/>
+        <w:gridCol w:w="7416"/>
       </w:tblGrid>
       <w:tr>
         <w:trPr>
+          <w:cantSplit/>
           <w:tblHeader/>
         </w:trPr>
         <w:tc>
           <w:tcPr>
-            <w:tcW w:type="dxa" w:w="1900"/>
-            <w:tcBorders>
-              <w:top w:val="single" w:color="AAAAAA" w:sz="6"/>
-              <w:left w:val="single" w:color="AAAAAA" w:sz="6"/>
-              <w:bottom w:val="single" w:color="AAAAAA" w:sz="6"/>
-              <w:right w:val="single" w:color="AAAAAA" w:sz="6"/>
-            </w:tcBorders>
-            <w:shd w:fill="2A1A1A" w:val="clear"/>
-            <w:tcMar>
-              <w:top w:type="dxa" w:w="100"/>
-              <w:left w:type="dxa" w:w="140"/>
-              <w:bottom w:type="dxa" w:w="100"/>
-              <w:right w:type="dxa" w:w="140"/>
-            </w:tcMar>
-          </w:tcPr>
-          <w:p>
-            <w:r>
-              <w:rPr>
+            <w:tcW w:type="dxa" w:w="1656"/>
+            <w:vAlign w:val="center"/>
+            <w:tcMar>
+              <w:top w:w="90" w:type="dxa"/>
+              <w:left w:w="90" w:type="dxa"/>
+              <w:bottom w:w="90" w:type="dxa"/>
+              <w:right w:w="90" w:type="dxa"/>
+            </w:tcMar>
+            <w:shd w:fill="E9EDF1"/>
+          </w:tcPr>
+          <w:p>
+            <w:pPr>
+              <w:spacing w:after="60" w:before="60" w:line="288" w:lineRule="auto"/>
+            </w:pPr>
+            <w:r>
+              <w:rPr>
+                <w:rFonts w:ascii="Malgun Gothic" w:hAnsi="Malgun Gothic" w:eastAsia="맑은 고딕"/>
                 <w:b/>
-                <w:bCs/>
-                <w:color w:val="FFFFFF"/>
-                <w:sz w:val="22"/>
-                <w:szCs w:val="22"/>
-              </w:rPr>
-              <w:t xml:space="preserve">게임</w:t>
-            </w:r>
-          </w:p>
-        </w:tc>
-        <w:tc>
-          <w:tcPr>
-            <w:tcW w:type="dxa" w:w="2200"/>
-            <w:tcBorders>
-              <w:top w:val="single" w:color="AAAAAA" w:sz="6"/>
-              <w:left w:val="single" w:color="AAAAAA" w:sz="6"/>
-              <w:bottom w:val="single" w:color="AAAAAA" w:sz="6"/>
-              <w:right w:val="single" w:color="AAAAAA" w:sz="6"/>
-            </w:tcBorders>
-            <w:shd w:fill="2A1A1A" w:val="clear"/>
-            <w:tcMar>
-              <w:top w:type="dxa" w:w="100"/>
-              <w:left w:type="dxa" w:w="140"/>
-              <w:bottom w:type="dxa" w:w="100"/>
-              <w:right w:type="dxa" w:w="140"/>
-            </w:tcMar>
-          </w:tcPr>
-          <w:p>
-            <w:r>
-              <w:rPr>
+                <w:color w:val="000000"/>
+                <w:sz w:val="20"/>
+              </w:rPr>
+              <w:t>구분</w:t>
+            </w:r>
+          </w:p>
+        </w:tc>
+        <w:tc>
+          <w:tcPr>
+            <w:tcW w:type="dxa" w:w="7416"/>
+            <w:vAlign w:val="center"/>
+            <w:tcMar>
+              <w:top w:w="90" w:type="dxa"/>
+              <w:left w:w="90" w:type="dxa"/>
+              <w:bottom w:w="90" w:type="dxa"/>
+              <w:right w:w="90" w:type="dxa"/>
+            </w:tcMar>
+            <w:shd w:fill="E9EDF1"/>
+          </w:tcPr>
+          <w:p>
+            <w:pPr>
+              <w:spacing w:after="60" w:before="60" w:line="288" w:lineRule="auto"/>
+            </w:pPr>
+            <w:r>
+              <w:rPr>
+                <w:rFonts w:ascii="Malgun Gothic" w:hAnsi="Malgun Gothic" w:eastAsia="맑은 고딕"/>
                 <w:b/>
-                <w:bCs/>
-                <w:color w:val="FFFFFF"/>
-                <w:sz w:val="22"/>
-                <w:szCs w:val="22"/>
-              </w:rPr>
-              <w:t xml:space="preserve">개발사 규모</w:t>
-            </w:r>
-          </w:p>
-        </w:tc>
-        <w:tc>
-          <w:tcPr>
-            <w:tcW w:type="dxa" w:w="1200"/>
-            <w:tcBorders>
-              <w:top w:val="single" w:color="AAAAAA" w:sz="6"/>
-              <w:left w:val="single" w:color="AAAAAA" w:sz="6"/>
-              <w:bottom w:val="single" w:color="AAAAAA" w:sz="6"/>
-              <w:right w:val="single" w:color="AAAAAA" w:sz="6"/>
-            </w:tcBorders>
-            <w:shd w:fill="2A1A1A" w:val="clear"/>
-            <w:tcMar>
-              <w:top w:type="dxa" w:w="100"/>
-              <w:left w:type="dxa" w:w="140"/>
-              <w:bottom w:type="dxa" w:w="100"/>
-              <w:right w:type="dxa" w:w="140"/>
-            </w:tcMar>
-          </w:tcPr>
-          <w:p>
-            <w:r>
-              <w:rPr>
-                <w:b/>
-                <w:bCs/>
-                <w:color w:val="FFFFFF"/>
-                <w:sz w:val="22"/>
-                <w:szCs w:val="22"/>
-              </w:rPr>
-              <w:t xml:space="preserve">출시년도</w:t>
-            </w:r>
-          </w:p>
-        </w:tc>
-        <w:tc>
-          <w:tcPr>
-            <w:tcW w:type="dxa" w:w="1900"/>
-            <w:tcBorders>
-              <w:top w:val="single" w:color="AAAAAA" w:sz="6"/>
-              <w:left w:val="single" w:color="AAAAAA" w:sz="6"/>
-              <w:bottom w:val="single" w:color="AAAAAA" w:sz="6"/>
-              <w:right w:val="single" w:color="AAAAAA" w:sz="6"/>
-            </w:tcBorders>
-            <w:shd w:fill="2A1A1A" w:val="clear"/>
-            <w:tcMar>
-              <w:top w:type="dxa" w:w="100"/>
-              <w:left w:type="dxa" w:w="140"/>
-              <w:bottom w:type="dxa" w:w="100"/>
-              <w:right w:type="dxa" w:w="140"/>
-            </w:tcMar>
-          </w:tcPr>
-          <w:p>
-            <w:r>
-              <w:rPr>
-                <w:b/>
-                <w:bCs/>
-                <w:color w:val="FFFFFF"/>
-                <w:sz w:val="22"/>
-                <w:szCs w:val="22"/>
-              </w:rPr>
-              <w:t xml:space="preserve">누적 판매</w:t>
-            </w:r>
-          </w:p>
-        </w:tc>
-        <w:tc>
-          <w:tcPr>
-            <w:tcW w:type="dxa" w:w="2160"/>
-            <w:tcBorders>
-              <w:top w:val="single" w:color="AAAAAA" w:sz="6"/>
-              <w:left w:val="single" w:color="AAAAAA" w:sz="6"/>
-              <w:bottom w:val="single" w:color="AAAAAA" w:sz="6"/>
-              <w:right w:val="single" w:color="AAAAAA" w:sz="6"/>
-            </w:tcBorders>
-            <w:shd w:fill="2A1A1A" w:val="clear"/>
-            <w:tcMar>
-              <w:top w:type="dxa" w:w="100"/>
-              <w:left w:type="dxa" w:w="140"/>
-              <w:bottom w:type="dxa" w:w="100"/>
-              <w:right w:type="dxa" w:w="140"/>
-            </w:tcMar>
-          </w:tcPr>
-          <w:p>
-            <w:r>
-              <w:rPr>
-                <w:b/>
-                <w:bCs/>
-                <w:color w:val="FFFFFF"/>
-                <w:sz w:val="22"/>
-                <w:szCs w:val="22"/>
-              </w:rPr>
-              <w:t xml:space="preserve">Steam 평점</w:t>
+                <w:color w:val="000000"/>
+                <w:sz w:val="20"/>
+              </w:rPr>
+              <w:t>기획 기준</w:t>
             </w:r>
           </w:p>
         </w:tc>
       </w:tr>
       <w:tr>
-        <w:tc>
-          <w:tcPr>
-            <w:tcW w:type="dxa" w:w="1900"/>
-            <w:tcBorders>
-              <w:top w:val="single" w:color="AAAAAA" w:sz="6"/>
-              <w:left w:val="single" w:color="AAAAAA" w:sz="6"/>
-              <w:bottom w:val="single" w:color="AAAAAA" w:sz="6"/>
-              <w:right w:val="single" w:color="AAAAAA" w:sz="6"/>
-            </w:tcBorders>
-            <w:shd w:fill="F8F4F0" w:val="clear"/>
-            <w:tcMar>
-              <w:top w:type="dxa" w:w="80"/>
-              <w:left w:type="dxa" w:w="140"/>
-              <w:bottom w:type="dxa" w:w="80"/>
-              <w:right w:type="dxa" w:w="140"/>
-            </w:tcMar>
-          </w:tcPr>
-          <w:p>
-            <w:r>
-              <w:rPr>
-                <w:sz w:val="22"/>
-                <w:szCs w:val="22"/>
-              </w:rPr>
-              <w:t xml:space="preserve">Hollow Knight</w:t>
-            </w:r>
-          </w:p>
-        </w:tc>
-        <w:tc>
-          <w:tcPr>
-            <w:tcW w:type="dxa" w:w="2200"/>
-            <w:tcBorders>
-              <w:top w:val="single" w:color="AAAAAA" w:sz="6"/>
-              <w:left w:val="single" w:color="AAAAAA" w:sz="6"/>
-              <w:bottom w:val="single" w:color="AAAAAA" w:sz="6"/>
-              <w:right w:val="single" w:color="AAAAAA" w:sz="6"/>
-            </w:tcBorders>
-            <w:shd w:fill="F8F4F0" w:val="clear"/>
-            <w:tcMar>
-              <w:top w:type="dxa" w:w="80"/>
-              <w:left w:type="dxa" w:w="140"/>
-              <w:bottom w:type="dxa" w:w="80"/>
-              <w:right w:type="dxa" w:w="140"/>
-            </w:tcMar>
-          </w:tcPr>
-          <w:p>
-            <w:r>
-              <w:rPr>
-                <w:sz w:val="22"/>
-                <w:szCs w:val="22"/>
-              </w:rPr>
-              <w:t xml:space="preserve">3인 (Team Cherry)</w:t>
-            </w:r>
-          </w:p>
-        </w:tc>
-        <w:tc>
-          <w:tcPr>
-            <w:tcW w:type="dxa" w:w="1200"/>
-            <w:tcBorders>
-              <w:top w:val="single" w:color="AAAAAA" w:sz="6"/>
-              <w:left w:val="single" w:color="AAAAAA" w:sz="6"/>
-              <w:bottom w:val="single" w:color="AAAAAA" w:sz="6"/>
-              <w:right w:val="single" w:color="AAAAAA" w:sz="6"/>
-            </w:tcBorders>
-            <w:shd w:fill="F8F4F0" w:val="clear"/>
-            <w:tcMar>
-              <w:top w:type="dxa" w:w="80"/>
-              <w:left w:type="dxa" w:w="140"/>
-              <w:bottom w:type="dxa" w:w="80"/>
-              <w:right w:type="dxa" w:w="140"/>
-            </w:tcMar>
-          </w:tcPr>
-          <w:p>
-            <w:r>
-              <w:rPr>
-                <w:sz w:val="22"/>
-                <w:szCs w:val="22"/>
-              </w:rPr>
-              <w:t xml:space="preserve">2017</w:t>
-            </w:r>
-          </w:p>
-        </w:tc>
-        <w:tc>
-          <w:tcPr>
-            <w:tcW w:type="dxa" w:w="1900"/>
-            <w:tcBorders>
-              <w:top w:val="single" w:color="AAAAAA" w:sz="6"/>
-              <w:left w:val="single" w:color="AAAAAA" w:sz="6"/>
-              <w:bottom w:val="single" w:color="AAAAAA" w:sz="6"/>
-              <w:right w:val="single" w:color="AAAAAA" w:sz="6"/>
-            </w:tcBorders>
-            <w:shd w:fill="F8F4F0" w:val="clear"/>
-            <w:tcMar>
-              <w:top w:type="dxa" w:w="80"/>
-              <w:left w:type="dxa" w:w="140"/>
-              <w:bottom w:type="dxa" w:w="80"/>
-              <w:right w:type="dxa" w:w="140"/>
-            </w:tcMar>
-          </w:tcPr>
-          <w:p>
-            <w:r>
-              <w:rPr>
-                <w:sz w:val="22"/>
-                <w:szCs w:val="22"/>
-              </w:rPr>
-              <w:t xml:space="preserve">1,500만+</w:t>
-            </w:r>
-          </w:p>
-        </w:tc>
-        <w:tc>
-          <w:tcPr>
-            <w:tcW w:type="dxa" w:w="2160"/>
-            <w:tcBorders>
-              <w:top w:val="single" w:color="AAAAAA" w:sz="6"/>
-              <w:left w:val="single" w:color="AAAAAA" w:sz="6"/>
-              <w:bottom w:val="single" w:color="AAAAAA" w:sz="6"/>
-              <w:right w:val="single" w:color="AAAAAA" w:sz="6"/>
-            </w:tcBorders>
-            <w:shd w:fill="F8F4F0" w:val="clear"/>
-            <w:tcMar>
-              <w:top w:type="dxa" w:w="80"/>
-              <w:left w:type="dxa" w:w="140"/>
-              <w:bottom w:type="dxa" w:w="80"/>
-              <w:right w:type="dxa" w:w="140"/>
-            </w:tcMar>
-          </w:tcPr>
-          <w:p>
-            <w:r>
-              <w:rPr>
-                <w:sz w:val="22"/>
-                <w:szCs w:val="22"/>
-              </w:rPr>
-              <w:t xml:space="preserve">압도적 긍정</w:t>
+        <w:trPr>
+          <w:cantSplit/>
+        </w:trPr>
+        <w:tc>
+          <w:tcPr>
+            <w:tcW w:type="dxa" w:w="1656"/>
+            <w:vAlign w:val="center"/>
+            <w:tcMar>
+              <w:top w:w="90" w:type="dxa"/>
+              <w:left w:w="90" w:type="dxa"/>
+              <w:bottom w:w="90" w:type="dxa"/>
+              <w:right w:w="90" w:type="dxa"/>
+            </w:tcMar>
+          </w:tcPr>
+          <w:p>
+            <w:pPr>
+              <w:spacing w:after="60" w:before="60" w:line="288" w:lineRule="auto"/>
+            </w:pPr>
+            <w:r>
+              <w:rPr>
+                <w:rFonts w:ascii="Malgun Gothic" w:hAnsi="Malgun Gothic" w:eastAsia="맑은 고딕"/>
+                <w:b w:val="0"/>
+                <w:color w:val="000000"/>
+                <w:sz w:val="20"/>
+              </w:rPr>
+              <w:t>핵심 고객</w:t>
+            </w:r>
+          </w:p>
+        </w:tc>
+        <w:tc>
+          <w:tcPr>
+            <w:tcW w:type="dxa" w:w="7416"/>
+            <w:vAlign w:val="center"/>
+            <w:tcMar>
+              <w:top w:w="90" w:type="dxa"/>
+              <w:left w:w="90" w:type="dxa"/>
+              <w:bottom w:w="90" w:type="dxa"/>
+              <w:right w:w="90" w:type="dxa"/>
+            </w:tcMar>
+          </w:tcPr>
+          <w:p>
+            <w:pPr>
+              <w:spacing w:after="60" w:before="60" w:line="288" w:lineRule="auto"/>
+            </w:pPr>
+            <w:r>
+              <w:rPr>
+                <w:rFonts w:ascii="Malgun Gothic" w:hAnsi="Malgun Gothic" w:eastAsia="맑은 고딕"/>
+                <w:b w:val="0"/>
+                <w:color w:val="000000"/>
+                <w:sz w:val="20"/>
+              </w:rPr>
+              <w:t>디아블로·PoE·라스트 에폭 등 시즌제 핵앤슬래시를 즐기는 글로벌 PC 이용자</w:t>
             </w:r>
           </w:p>
         </w:tc>
       </w:tr>
       <w:tr>
-        <w:tc>
-          <w:tcPr>
-            <w:tcW w:type="dxa" w:w="1900"/>
-            <w:tcBorders>
-              <w:top w:val="single" w:color="AAAAAA" w:sz="6"/>
-              <w:left w:val="single" w:color="AAAAAA" w:sz="6"/>
-              <w:bottom w:val="single" w:color="AAAAAA" w:sz="6"/>
-              <w:right w:val="single" w:color="AAAAAA" w:sz="6"/>
-            </w:tcBorders>
-            <w:shd w:fill="FFFFFF" w:val="clear"/>
-            <w:tcMar>
-              <w:top w:type="dxa" w:w="80"/>
-              <w:left w:type="dxa" w:w="140"/>
-              <w:bottom w:type="dxa" w:w="80"/>
-              <w:right w:type="dxa" w:w="140"/>
-            </w:tcMar>
-          </w:tcPr>
-          <w:p>
-            <w:r>
-              <w:rPr>
-                <w:sz w:val="22"/>
-                <w:szCs w:val="22"/>
-              </w:rPr>
-              <w:t xml:space="preserve">Dead Cells</w:t>
-            </w:r>
-          </w:p>
-        </w:tc>
-        <w:tc>
-          <w:tcPr>
-            <w:tcW w:type="dxa" w:w="2200"/>
-            <w:tcBorders>
-              <w:top w:val="single" w:color="AAAAAA" w:sz="6"/>
-              <w:left w:val="single" w:color="AAAAAA" w:sz="6"/>
-              <w:bottom w:val="single" w:color="AAAAAA" w:sz="6"/>
-              <w:right w:val="single" w:color="AAAAAA" w:sz="6"/>
-            </w:tcBorders>
-            <w:shd w:fill="FFFFFF" w:val="clear"/>
-            <w:tcMar>
-              <w:top w:type="dxa" w:w="80"/>
-              <w:left w:type="dxa" w:w="140"/>
-              <w:bottom w:type="dxa" w:w="80"/>
-              <w:right w:type="dxa" w:w="140"/>
-            </w:tcMar>
-          </w:tcPr>
-          <w:p>
-            <w:r>
-              <w:rPr>
-                <w:sz w:val="22"/>
-                <w:szCs w:val="22"/>
-              </w:rPr>
-              <w:t xml:space="preserve">Motion Twin (소형)</w:t>
-            </w:r>
-          </w:p>
-        </w:tc>
-        <w:tc>
-          <w:tcPr>
-            <w:tcW w:type="dxa" w:w="1200"/>
-            <w:tcBorders>
-              <w:top w:val="single" w:color="AAAAAA" w:sz="6"/>
-              <w:left w:val="single" w:color="AAAAAA" w:sz="6"/>
-              <w:bottom w:val="single" w:color="AAAAAA" w:sz="6"/>
-              <w:right w:val="single" w:color="AAAAAA" w:sz="6"/>
-            </w:tcBorders>
-            <w:shd w:fill="FFFFFF" w:val="clear"/>
-            <w:tcMar>
-              <w:top w:type="dxa" w:w="80"/>
-              <w:left w:type="dxa" w:w="140"/>
-              <w:bottom w:type="dxa" w:w="80"/>
-              <w:right w:type="dxa" w:w="140"/>
-            </w:tcMar>
-          </w:tcPr>
-          <w:p>
-            <w:r>
-              <w:rPr>
-                <w:sz w:val="22"/>
-                <w:szCs w:val="22"/>
-              </w:rPr>
-              <w:t xml:space="preserve">2018</w:t>
-            </w:r>
-          </w:p>
-        </w:tc>
-        <w:tc>
-          <w:tcPr>
-            <w:tcW w:type="dxa" w:w="1900"/>
-            <w:tcBorders>
-              <w:top w:val="single" w:color="AAAAAA" w:sz="6"/>
-              <w:left w:val="single" w:color="AAAAAA" w:sz="6"/>
-              <w:bottom w:val="single" w:color="AAAAAA" w:sz="6"/>
-              <w:right w:val="single" w:color="AAAAAA" w:sz="6"/>
-            </w:tcBorders>
-            <w:shd w:fill="FFFFFF" w:val="clear"/>
-            <w:tcMar>
-              <w:top w:type="dxa" w:w="80"/>
-              <w:left w:type="dxa" w:w="140"/>
-              <w:bottom w:type="dxa" w:w="80"/>
-              <w:right w:type="dxa" w:w="140"/>
-            </w:tcMar>
-          </w:tcPr>
-          <w:p>
-            <w:r>
-              <w:rPr>
-                <w:sz w:val="22"/>
-                <w:szCs w:val="22"/>
-              </w:rPr>
-              <w:t xml:space="preserve">1,000만+</w:t>
-            </w:r>
-          </w:p>
-        </w:tc>
-        <w:tc>
-          <w:tcPr>
-            <w:tcW w:type="dxa" w:w="2160"/>
-            <w:tcBorders>
-              <w:top w:val="single" w:color="AAAAAA" w:sz="6"/>
-              <w:left w:val="single" w:color="AAAAAA" w:sz="6"/>
-              <w:bottom w:val="single" w:color="AAAAAA" w:sz="6"/>
-              <w:right w:val="single" w:color="AAAAAA" w:sz="6"/>
-            </w:tcBorders>
-            <w:shd w:fill="FFFFFF" w:val="clear"/>
-            <w:tcMar>
-              <w:top w:type="dxa" w:w="80"/>
-              <w:left w:type="dxa" w:w="140"/>
-              <w:bottom w:type="dxa" w:w="80"/>
-              <w:right w:type="dxa" w:w="140"/>
-            </w:tcMar>
-          </w:tcPr>
-          <w:p>
-            <w:r>
-              <w:rPr>
-                <w:sz w:val="22"/>
-                <w:szCs w:val="22"/>
-              </w:rPr>
-              <w:t xml:space="preserve">압도적 긍정</w:t>
+        <w:trPr>
+          <w:cantSplit/>
+        </w:trPr>
+        <w:tc>
+          <w:tcPr>
+            <w:tcW w:type="dxa" w:w="1656"/>
+            <w:vAlign w:val="center"/>
+            <w:tcMar>
+              <w:top w:w="90" w:type="dxa"/>
+              <w:left w:w="90" w:type="dxa"/>
+              <w:bottom w:w="90" w:type="dxa"/>
+              <w:right w:w="90" w:type="dxa"/>
+            </w:tcMar>
+          </w:tcPr>
+          <w:p>
+            <w:pPr>
+              <w:spacing w:after="60" w:before="60" w:line="288" w:lineRule="auto"/>
+            </w:pPr>
+            <w:r>
+              <w:rPr>
+                <w:rFonts w:ascii="Malgun Gothic" w:hAnsi="Malgun Gothic" w:eastAsia="맑은 고딕"/>
+                <w:b w:val="0"/>
+                <w:color w:val="000000"/>
+                <w:sz w:val="20"/>
+              </w:rPr>
+              <w:t>우선 고객상</w:t>
+            </w:r>
+          </w:p>
+        </w:tc>
+        <w:tc>
+          <w:tcPr>
+            <w:tcW w:type="dxa" w:w="7416"/>
+            <w:vAlign w:val="center"/>
+            <w:tcMar>
+              <w:top w:w="90" w:type="dxa"/>
+              <w:left w:w="90" w:type="dxa"/>
+              <w:bottom w:w="90" w:type="dxa"/>
+              <w:right w:w="90" w:type="dxa"/>
+            </w:tcMar>
+          </w:tcPr>
+          <w:p>
+            <w:pPr>
+              <w:spacing w:after="60" w:before="60" w:line="288" w:lineRule="auto"/>
+            </w:pPr>
+            <w:r>
+              <w:rPr>
+                <w:rFonts w:ascii="Malgun Gothic" w:hAnsi="Malgun Gothic" w:eastAsia="맑은 고딕"/>
+                <w:b w:val="0"/>
+                <w:color w:val="000000"/>
+                <w:sz w:val="20"/>
+              </w:rPr>
+              <w:t>장르 경험이 많고 완성도 있는 유료 게임에 지불 의향이 있는 성인층</w:t>
             </w:r>
           </w:p>
         </w:tc>
       </w:tr>
       <w:tr>
-        <w:tc>
-          <w:tcPr>
-            <w:tcW w:type="dxa" w:w="1900"/>
-            <w:tcBorders>
-              <w:top w:val="single" w:color="AAAAAA" w:sz="6"/>
-              <w:left w:val="single" w:color="AAAAAA" w:sz="6"/>
-              <w:bottom w:val="single" w:color="AAAAAA" w:sz="6"/>
-              <w:right w:val="single" w:color="AAAAAA" w:sz="6"/>
-            </w:tcBorders>
-            <w:shd w:fill="F8F4F0" w:val="clear"/>
-            <w:tcMar>
-              <w:top w:type="dxa" w:w="80"/>
-              <w:left w:type="dxa" w:w="140"/>
-              <w:bottom w:type="dxa" w:w="80"/>
-              <w:right w:type="dxa" w:w="140"/>
-            </w:tcMar>
-          </w:tcPr>
-          <w:p>
-            <w:r>
-              <w:rPr>
-                <w:sz w:val="22"/>
-                <w:szCs w:val="22"/>
-              </w:rPr>
-              <w:t xml:space="preserve">Hades</w:t>
-            </w:r>
-          </w:p>
-        </w:tc>
-        <w:tc>
-          <w:tcPr>
-            <w:tcW w:type="dxa" w:w="2200"/>
-            <w:tcBorders>
-              <w:top w:val="single" w:color="AAAAAA" w:sz="6"/>
-              <w:left w:val="single" w:color="AAAAAA" w:sz="6"/>
-              <w:bottom w:val="single" w:color="AAAAAA" w:sz="6"/>
-              <w:right w:val="single" w:color="AAAAAA" w:sz="6"/>
-            </w:tcBorders>
-            <w:shd w:fill="F8F4F0" w:val="clear"/>
-            <w:tcMar>
-              <w:top w:type="dxa" w:w="80"/>
-              <w:left w:type="dxa" w:w="140"/>
-              <w:bottom w:type="dxa" w:w="80"/>
-              <w:right w:type="dxa" w:w="140"/>
-            </w:tcMar>
-          </w:tcPr>
-          <w:p>
-            <w:r>
-              <w:rPr>
-                <w:sz w:val="22"/>
-                <w:szCs w:val="22"/>
-              </w:rPr>
-              <w:t xml:space="preserve">Supergiant (소형)</w:t>
-            </w:r>
-          </w:p>
-        </w:tc>
-        <w:tc>
-          <w:tcPr>
-            <w:tcW w:type="dxa" w:w="1200"/>
-            <w:tcBorders>
-              <w:top w:val="single" w:color="AAAAAA" w:sz="6"/>
-              <w:left w:val="single" w:color="AAAAAA" w:sz="6"/>
-              <w:bottom w:val="single" w:color="AAAAAA" w:sz="6"/>
-              <w:right w:val="single" w:color="AAAAAA" w:sz="6"/>
-            </w:tcBorders>
-            <w:shd w:fill="F8F4F0" w:val="clear"/>
-            <w:tcMar>
-              <w:top w:type="dxa" w:w="80"/>
-              <w:left w:type="dxa" w:w="140"/>
-              <w:bottom w:type="dxa" w:w="80"/>
-              <w:right w:type="dxa" w:w="140"/>
-            </w:tcMar>
-          </w:tcPr>
-          <w:p>
-            <w:r>
-              <w:rPr>
-                <w:sz w:val="22"/>
-                <w:szCs w:val="22"/>
-              </w:rPr>
-              <w:t xml:space="preserve">2020</w:t>
-            </w:r>
-          </w:p>
-        </w:tc>
-        <w:tc>
-          <w:tcPr>
-            <w:tcW w:type="dxa" w:w="1900"/>
-            <w:tcBorders>
-              <w:top w:val="single" w:color="AAAAAA" w:sz="6"/>
-              <w:left w:val="single" w:color="AAAAAA" w:sz="6"/>
-              <w:bottom w:val="single" w:color="AAAAAA" w:sz="6"/>
-              <w:right w:val="single" w:color="AAAAAA" w:sz="6"/>
-            </w:tcBorders>
-            <w:shd w:fill="F8F4F0" w:val="clear"/>
-            <w:tcMar>
-              <w:top w:type="dxa" w:w="80"/>
-              <w:left w:type="dxa" w:w="140"/>
-              <w:bottom w:type="dxa" w:w="80"/>
-              <w:right w:type="dxa" w:w="140"/>
-            </w:tcMar>
-          </w:tcPr>
-          <w:p>
-            <w:r>
-              <w:rPr>
-                <w:sz w:val="22"/>
-                <w:szCs w:val="22"/>
-              </w:rPr>
-              <w:t xml:space="preserve">1,000만+</w:t>
-            </w:r>
-          </w:p>
-        </w:tc>
-        <w:tc>
-          <w:tcPr>
-            <w:tcW w:type="dxa" w:w="2160"/>
-            <w:tcBorders>
-              <w:top w:val="single" w:color="AAAAAA" w:sz="6"/>
-              <w:left w:val="single" w:color="AAAAAA" w:sz="6"/>
-              <w:bottom w:val="single" w:color="AAAAAA" w:sz="6"/>
-              <w:right w:val="single" w:color="AAAAAA" w:sz="6"/>
-            </w:tcBorders>
-            <w:shd w:fill="F8F4F0" w:val="clear"/>
-            <w:tcMar>
-              <w:top w:type="dxa" w:w="80"/>
-              <w:left w:type="dxa" w:w="140"/>
-              <w:bottom w:type="dxa" w:w="80"/>
-              <w:right w:type="dxa" w:w="140"/>
-            </w:tcMar>
-          </w:tcPr>
-          <w:p>
-            <w:r>
-              <w:rPr>
-                <w:sz w:val="22"/>
-                <w:szCs w:val="22"/>
-              </w:rPr>
-              <w:t xml:space="preserve">압도적 긍정</w:t>
+        <w:trPr>
+          <w:cantSplit/>
+        </w:trPr>
+        <w:tc>
+          <w:tcPr>
+            <w:tcW w:type="dxa" w:w="1656"/>
+            <w:vAlign w:val="center"/>
+            <w:tcMar>
+              <w:top w:w="90" w:type="dxa"/>
+              <w:left w:w="90" w:type="dxa"/>
+              <w:bottom w:w="90" w:type="dxa"/>
+              <w:right w:w="90" w:type="dxa"/>
+            </w:tcMar>
+          </w:tcPr>
+          <w:p>
+            <w:pPr>
+              <w:spacing w:after="60" w:before="60" w:line="288" w:lineRule="auto"/>
+            </w:pPr>
+            <w:r>
+              <w:rPr>
+                <w:rFonts w:ascii="Malgun Gothic" w:hAnsi="Malgun Gothic" w:eastAsia="맑은 고딕"/>
+                <w:b w:val="0"/>
+                <w:color w:val="000000"/>
+                <w:sz w:val="20"/>
+              </w:rPr>
+              <w:t>진입 기회</w:t>
+            </w:r>
+          </w:p>
+        </w:tc>
+        <w:tc>
+          <w:tcPr>
+            <w:tcW w:type="dxa" w:w="7416"/>
+            <w:vAlign w:val="center"/>
+            <w:tcMar>
+              <w:top w:w="90" w:type="dxa"/>
+              <w:left w:w="90" w:type="dxa"/>
+              <w:bottom w:w="90" w:type="dxa"/>
+              <w:right w:w="90" w:type="dxa"/>
+            </w:tcMar>
+          </w:tcPr>
+          <w:p>
+            <w:pPr>
+              <w:spacing w:after="60" w:before="60" w:line="288" w:lineRule="auto"/>
+            </w:pPr>
+            <w:r>
+              <w:rPr>
+                <w:rFonts w:ascii="Malgun Gothic" w:hAnsi="Malgun Gothic" w:eastAsia="맑은 고딕"/>
+                <w:b w:val="0"/>
+                <w:color w:val="000000"/>
+                <w:sz w:val="20"/>
+              </w:rPr>
+              <w:t>시즌 목표 달성 뒤 다음 시즌까지 다른 핵앤슬래시를 찾는 수요</w:t>
             </w:r>
           </w:p>
         </w:tc>
       </w:tr>
       <w:tr>
-        <w:tc>
-          <w:tcPr>
-            <w:tcW w:type="dxa" w:w="1900"/>
-            <w:tcBorders>
-              <w:top w:val="single" w:color="AAAAAA" w:sz="6"/>
-              <w:left w:val="single" w:color="AAAAAA" w:sz="6"/>
-              <w:bottom w:val="single" w:color="AAAAAA" w:sz="6"/>
-              <w:right w:val="single" w:color="AAAAAA" w:sz="6"/>
-            </w:tcBorders>
-            <w:shd w:fill="FFFFFF" w:val="clear"/>
-            <w:tcMar>
-              <w:top w:type="dxa" w:w="80"/>
-              <w:left w:type="dxa" w:w="140"/>
-              <w:bottom w:type="dxa" w:w="80"/>
-              <w:right w:type="dxa" w:w="140"/>
-            </w:tcMar>
-          </w:tcPr>
-          <w:p>
-            <w:r>
-              <w:rPr>
-                <w:sz w:val="22"/>
-                <w:szCs w:val="22"/>
-              </w:rPr>
-              <w:t xml:space="preserve">Salt and Sanctuary</w:t>
-            </w:r>
-          </w:p>
-        </w:tc>
-        <w:tc>
-          <w:tcPr>
-            <w:tcW w:type="dxa" w:w="2200"/>
-            <w:tcBorders>
-              <w:top w:val="single" w:color="AAAAAA" w:sz="6"/>
-              <w:left w:val="single" w:color="AAAAAA" w:sz="6"/>
-              <w:bottom w:val="single" w:color="AAAAAA" w:sz="6"/>
-              <w:right w:val="single" w:color="AAAAAA" w:sz="6"/>
-            </w:tcBorders>
-            <w:shd w:fill="FFFFFF" w:val="clear"/>
-            <w:tcMar>
-              <w:top w:type="dxa" w:w="80"/>
-              <w:left w:type="dxa" w:w="140"/>
-              <w:bottom w:type="dxa" w:w="80"/>
-              <w:right w:type="dxa" w:w="140"/>
-            </w:tcMar>
-          </w:tcPr>
-          <w:p>
-            <w:r>
-              <w:rPr>
-                <w:sz w:val="22"/>
-                <w:szCs w:val="22"/>
-              </w:rPr>
-              <w:t xml:space="preserve">2인 (Ska Studios)</w:t>
-            </w:r>
-          </w:p>
-        </w:tc>
-        <w:tc>
-          <w:tcPr>
-            <w:tcW w:type="dxa" w:w="1200"/>
-            <w:tcBorders>
-              <w:top w:val="single" w:color="AAAAAA" w:sz="6"/>
-              <w:left w:val="single" w:color="AAAAAA" w:sz="6"/>
-              <w:bottom w:val="single" w:color="AAAAAA" w:sz="6"/>
-              <w:right w:val="single" w:color="AAAAAA" w:sz="6"/>
-            </w:tcBorders>
-            <w:shd w:fill="FFFFFF" w:val="clear"/>
-            <w:tcMar>
-              <w:top w:type="dxa" w:w="80"/>
-              <w:left w:type="dxa" w:w="140"/>
-              <w:bottom w:type="dxa" w:w="80"/>
-              <w:right w:type="dxa" w:w="140"/>
-            </w:tcMar>
-          </w:tcPr>
-          <w:p>
-            <w:r>
-              <w:rPr>
-                <w:sz w:val="22"/>
-                <w:szCs w:val="22"/>
-              </w:rPr>
-              <w:t xml:space="preserve">2016</w:t>
-            </w:r>
-          </w:p>
-        </w:tc>
-        <w:tc>
-          <w:tcPr>
-            <w:tcW w:type="dxa" w:w="1900"/>
-            <w:tcBorders>
-              <w:top w:val="single" w:color="AAAAAA" w:sz="6"/>
-              <w:left w:val="single" w:color="AAAAAA" w:sz="6"/>
-              <w:bottom w:val="single" w:color="AAAAAA" w:sz="6"/>
-              <w:right w:val="single" w:color="AAAAAA" w:sz="6"/>
-            </w:tcBorders>
-            <w:shd w:fill="FFFFFF" w:val="clear"/>
-            <w:tcMar>
-              <w:top w:type="dxa" w:w="80"/>
-              <w:left w:type="dxa" w:w="140"/>
-              <w:bottom w:type="dxa" w:w="80"/>
-              <w:right w:type="dxa" w:w="140"/>
-            </w:tcMar>
-          </w:tcPr>
-          <w:p>
-            <w:r>
-              <w:rPr>
-                <w:sz w:val="22"/>
-                <w:szCs w:val="22"/>
-              </w:rPr>
-              <w:t xml:space="preserve">300만+</w:t>
-            </w:r>
-          </w:p>
-        </w:tc>
-        <w:tc>
-          <w:tcPr>
-            <w:tcW w:type="dxa" w:w="2160"/>
-            <w:tcBorders>
-              <w:top w:val="single" w:color="AAAAAA" w:sz="6"/>
-              <w:left w:val="single" w:color="AAAAAA" w:sz="6"/>
-              <w:bottom w:val="single" w:color="AAAAAA" w:sz="6"/>
-              <w:right w:val="single" w:color="AAAAAA" w:sz="6"/>
-            </w:tcBorders>
-            <w:shd w:fill="FFFFFF" w:val="clear"/>
-            <w:tcMar>
-              <w:top w:type="dxa" w:w="80"/>
-              <w:left w:type="dxa" w:w="140"/>
-              <w:bottom w:type="dxa" w:w="80"/>
-              <w:right w:type="dxa" w:w="140"/>
-            </w:tcMar>
-          </w:tcPr>
-          <w:p>
-            <w:r>
-              <w:rPr>
-                <w:sz w:val="22"/>
-                <w:szCs w:val="22"/>
-              </w:rPr>
-              <w:t xml:space="preserve">매우 긍정적</w:t>
+        <w:trPr>
+          <w:cantSplit/>
+        </w:trPr>
+        <w:tc>
+          <w:tcPr>
+            <w:tcW w:type="dxa" w:w="1656"/>
+            <w:vAlign w:val="center"/>
+            <w:tcMar>
+              <w:top w:w="90" w:type="dxa"/>
+              <w:left w:w="90" w:type="dxa"/>
+              <w:bottom w:w="90" w:type="dxa"/>
+              <w:right w:w="90" w:type="dxa"/>
+            </w:tcMar>
+          </w:tcPr>
+          <w:p>
+            <w:pPr>
+              <w:spacing w:after="60" w:before="60" w:line="288" w:lineRule="auto"/>
+            </w:pPr>
+            <w:r>
+              <w:rPr>
+                <w:rFonts w:ascii="Malgun Gothic" w:hAnsi="Malgun Gothic" w:eastAsia="맑은 고딕"/>
+                <w:b w:val="0"/>
+                <w:color w:val="000000"/>
+                <w:sz w:val="20"/>
+              </w:rPr>
+              <w:t>참고 포지션</w:t>
+            </w:r>
+          </w:p>
+        </w:tc>
+        <w:tc>
+          <w:tcPr>
+            <w:tcW w:type="dxa" w:w="7416"/>
+            <w:vAlign w:val="center"/>
+            <w:tcMar>
+              <w:top w:w="90" w:type="dxa"/>
+              <w:left w:w="90" w:type="dxa"/>
+              <w:bottom w:w="90" w:type="dxa"/>
+              <w:right w:w="90" w:type="dxa"/>
+            </w:tcMar>
+          </w:tcPr>
+          <w:p>
+            <w:pPr>
+              <w:spacing w:after="60" w:before="60" w:line="288" w:lineRule="auto"/>
+            </w:pPr>
+            <w:r>
+              <w:rPr>
+                <w:rFonts w:ascii="Malgun Gothic" w:hAnsi="Malgun Gothic" w:eastAsia="맑은 고딕"/>
+                <w:b w:val="0"/>
+                <w:color w:val="000000"/>
+                <w:sz w:val="20"/>
+              </w:rPr>
+              <w:t>던전 시즈·라스트 에폭처럼 장르 안에서 독자적으로 선택받는 브랜드</w:t>
             </w:r>
           </w:p>
         </w:tc>
       </w:tr>
       <w:tr>
-        <w:tc>
-          <w:tcPr>
-            <w:tcW w:type="dxa" w:w="1900"/>
-            <w:tcBorders>
-              <w:top w:val="single" w:color="AAAAAA" w:sz="6"/>
-              <w:left w:val="single" w:color="AAAAAA" w:sz="6"/>
-              <w:bottom w:val="single" w:color="AAAAAA" w:sz="6"/>
-              <w:right w:val="single" w:color="AAAAAA" w:sz="6"/>
-            </w:tcBorders>
-            <w:shd w:fill="F8F4F0" w:val="clear"/>
-            <w:tcMar>
-              <w:top w:type="dxa" w:w="80"/>
-              <w:left w:type="dxa" w:w="140"/>
-              <w:bottom w:type="dxa" w:w="80"/>
-              <w:right w:type="dxa" w:w="140"/>
-            </w:tcMar>
-          </w:tcPr>
-          <w:p>
-            <w:r>
-              <w:rPr>
-                <w:sz w:val="22"/>
-                <w:szCs w:val="22"/>
-              </w:rPr>
-              <w:t xml:space="preserve">Blasphemous</w:t>
-            </w:r>
-          </w:p>
-        </w:tc>
-        <w:tc>
-          <w:tcPr>
-            <w:tcW w:type="dxa" w:w="2200"/>
-            <w:tcBorders>
-              <w:top w:val="single" w:color="AAAAAA" w:sz="6"/>
-              <w:left w:val="single" w:color="AAAAAA" w:sz="6"/>
-              <w:bottom w:val="single" w:color="AAAAAA" w:sz="6"/>
-              <w:right w:val="single" w:color="AAAAAA" w:sz="6"/>
-            </w:tcBorders>
-            <w:shd w:fill="F8F4F0" w:val="clear"/>
-            <w:tcMar>
-              <w:top w:type="dxa" w:w="80"/>
-              <w:left w:type="dxa" w:w="140"/>
-              <w:bottom w:type="dxa" w:w="80"/>
-              <w:right w:type="dxa" w:w="140"/>
-            </w:tcMar>
-          </w:tcPr>
-          <w:p>
-            <w:r>
-              <w:rPr>
-                <w:sz w:val="22"/>
-                <w:szCs w:val="22"/>
-              </w:rPr>
-              <w:t xml:space="preserve">The Game Kitchen (15인)</w:t>
-            </w:r>
-          </w:p>
-        </w:tc>
-        <w:tc>
-          <w:tcPr>
-            <w:tcW w:type="dxa" w:w="1200"/>
-            <w:tcBorders>
-              <w:top w:val="single" w:color="AAAAAA" w:sz="6"/>
-              <w:left w:val="single" w:color="AAAAAA" w:sz="6"/>
-              <w:bottom w:val="single" w:color="AAAAAA" w:sz="6"/>
-              <w:right w:val="single" w:color="AAAAAA" w:sz="6"/>
-            </w:tcBorders>
-            <w:shd w:fill="F8F4F0" w:val="clear"/>
-            <w:tcMar>
-              <w:top w:type="dxa" w:w="80"/>
-              <w:left w:type="dxa" w:w="140"/>
-              <w:bottom w:type="dxa" w:w="80"/>
-              <w:right w:type="dxa" w:w="140"/>
-            </w:tcMar>
-          </w:tcPr>
-          <w:p>
-            <w:r>
-              <w:rPr>
-                <w:sz w:val="22"/>
-                <w:szCs w:val="22"/>
-              </w:rPr>
-              <w:t xml:space="preserve">2019</w:t>
-            </w:r>
-          </w:p>
-        </w:tc>
-        <w:tc>
-          <w:tcPr>
-            <w:tcW w:type="dxa" w:w="1900"/>
-            <w:tcBorders>
-              <w:top w:val="single" w:color="AAAAAA" w:sz="6"/>
-              <w:left w:val="single" w:color="AAAAAA" w:sz="6"/>
-              <w:bottom w:val="single" w:color="AAAAAA" w:sz="6"/>
-              <w:right w:val="single" w:color="AAAAAA" w:sz="6"/>
-            </w:tcBorders>
-            <w:shd w:fill="F8F4F0" w:val="clear"/>
-            <w:tcMar>
-              <w:top w:type="dxa" w:w="80"/>
-              <w:left w:type="dxa" w:w="140"/>
-              <w:bottom w:type="dxa" w:w="80"/>
-              <w:right w:type="dxa" w:w="140"/>
-            </w:tcMar>
-          </w:tcPr>
-          <w:p>
-            <w:r>
-              <w:rPr>
-                <w:sz w:val="22"/>
-                <w:szCs w:val="22"/>
-              </w:rPr>
-              <w:t xml:space="preserve">500만+</w:t>
-            </w:r>
-          </w:p>
-        </w:tc>
-        <w:tc>
-          <w:tcPr>
-            <w:tcW w:type="dxa" w:w="2160"/>
-            <w:tcBorders>
-              <w:top w:val="single" w:color="AAAAAA" w:sz="6"/>
-              <w:left w:val="single" w:color="AAAAAA" w:sz="6"/>
-              <w:bottom w:val="single" w:color="AAAAAA" w:sz="6"/>
-              <w:right w:val="single" w:color="AAAAAA" w:sz="6"/>
-            </w:tcBorders>
-            <w:shd w:fill="F8F4F0" w:val="clear"/>
-            <w:tcMar>
-              <w:top w:type="dxa" w:w="80"/>
-              <w:left w:type="dxa" w:w="140"/>
-              <w:bottom w:type="dxa" w:w="80"/>
-              <w:right w:type="dxa" w:w="140"/>
-            </w:tcMar>
-          </w:tcPr>
-          <w:p>
-            <w:r>
-              <w:rPr>
-                <w:sz w:val="22"/>
-                <w:szCs w:val="22"/>
-              </w:rPr>
-              <w:t xml:space="preserve">매우 긍정적</w:t>
+        <w:trPr>
+          <w:cantSplit/>
+        </w:trPr>
+        <w:tc>
+          <w:tcPr>
+            <w:tcW w:type="dxa" w:w="1656"/>
+            <w:vAlign w:val="center"/>
+            <w:tcMar>
+              <w:top w:w="90" w:type="dxa"/>
+              <w:left w:w="90" w:type="dxa"/>
+              <w:bottom w:w="90" w:type="dxa"/>
+              <w:right w:w="90" w:type="dxa"/>
+            </w:tcMar>
+          </w:tcPr>
+          <w:p>
+            <w:pPr>
+              <w:spacing w:after="60" w:before="60" w:line="288" w:lineRule="auto"/>
+            </w:pPr>
+            <w:r>
+              <w:rPr>
+                <w:rFonts w:ascii="Malgun Gothic" w:hAnsi="Malgun Gothic" w:eastAsia="맑은 고딕"/>
+                <w:b w:val="0"/>
+                <w:color w:val="000000"/>
+                <w:sz w:val="20"/>
+              </w:rPr>
+              <w:t>확장 고객</w:t>
+            </w:r>
+          </w:p>
+        </w:tc>
+        <w:tc>
+          <w:tcPr>
+            <w:tcW w:type="dxa" w:w="7416"/>
+            <w:vAlign w:val="center"/>
+            <w:tcMar>
+              <w:top w:w="90" w:type="dxa"/>
+              <w:left w:w="90" w:type="dxa"/>
+              <w:bottom w:w="90" w:type="dxa"/>
+              <w:right w:w="90" w:type="dxa"/>
+            </w:tcMar>
+          </w:tcPr>
+          <w:p>
+            <w:pPr>
+              <w:spacing w:after="60" w:before="60" w:line="288" w:lineRule="auto"/>
+            </w:pPr>
+            <w:r>
+              <w:rPr>
+                <w:rFonts w:ascii="Malgun Gothic" w:hAnsi="Malgun Gothic" w:eastAsia="맑은 고딕"/>
+                <w:b w:val="0"/>
+                <w:color w:val="000000"/>
+                <w:sz w:val="20"/>
+              </w:rPr>
+              <w:t>액션 전투와 캐릭터 성장을 함께 즐기는 인접 ARPG 이용자</w:t>
             </w:r>
           </w:p>
         </w:tc>
       </w:tr>
       <w:tr>
-        <w:tc>
-          <w:tcPr>
-            <w:tcW w:type="dxa" w:w="1900"/>
-            <w:tcBorders>
-              <w:top w:val="single" w:color="AAAAAA" w:sz="6"/>
-              <w:left w:val="single" w:color="AAAAAA" w:sz="6"/>
-              <w:bottom w:val="single" w:color="AAAAAA" w:sz="6"/>
-              <w:right w:val="single" w:color="AAAAAA" w:sz="6"/>
-            </w:tcBorders>
-            <w:shd w:fill="FFFFFF" w:val="clear"/>
-            <w:tcMar>
-              <w:top w:type="dxa" w:w="80"/>
-              <w:left w:type="dxa" w:w="140"/>
-              <w:bottom w:type="dxa" w:w="80"/>
-              <w:right w:type="dxa" w:w="140"/>
-            </w:tcMar>
-          </w:tcPr>
-          <w:p>
-            <w:r>
-              <w:rPr>
-                <w:sz w:val="22"/>
-                <w:szCs w:val="22"/>
-              </w:rPr>
-              <w:t xml:space="preserve">Tunic</w:t>
-            </w:r>
-          </w:p>
-        </w:tc>
-        <w:tc>
-          <w:tcPr>
-            <w:tcW w:type="dxa" w:w="2200"/>
-            <w:tcBorders>
-              <w:top w:val="single" w:color="AAAAAA" w:sz="6"/>
-              <w:left w:val="single" w:color="AAAAAA" w:sz="6"/>
-              <w:bottom w:val="single" w:color="AAAAAA" w:sz="6"/>
-              <w:right w:val="single" w:color="AAAAAA" w:sz="6"/>
-            </w:tcBorders>
-            <w:shd w:fill="FFFFFF" w:val="clear"/>
-            <w:tcMar>
-              <w:top w:type="dxa" w:w="80"/>
-              <w:left w:type="dxa" w:w="140"/>
-              <w:bottom w:type="dxa" w:w="80"/>
-              <w:right w:type="dxa" w:w="140"/>
-            </w:tcMar>
-          </w:tcPr>
-          <w:p>
-            <w:r>
-              <w:rPr>
-                <w:sz w:val="22"/>
-                <w:szCs w:val="22"/>
-              </w:rPr>
-              <w:t xml:space="preserve">1인 (Andrew Shouldice)</w:t>
-            </w:r>
-          </w:p>
-        </w:tc>
-        <w:tc>
-          <w:tcPr>
-            <w:tcW w:type="dxa" w:w="1200"/>
-            <w:tcBorders>
-              <w:top w:val="single" w:color="AAAAAA" w:sz="6"/>
-              <w:left w:val="single" w:color="AAAAAA" w:sz="6"/>
-              <w:bottom w:val="single" w:color="AAAAAA" w:sz="6"/>
-              <w:right w:val="single" w:color="AAAAAA" w:sz="6"/>
-            </w:tcBorders>
-            <w:shd w:fill="FFFFFF" w:val="clear"/>
-            <w:tcMar>
-              <w:top w:type="dxa" w:w="80"/>
-              <w:left w:type="dxa" w:w="140"/>
-              <w:bottom w:type="dxa" w:w="80"/>
-              <w:right w:type="dxa" w:w="140"/>
-            </w:tcMar>
-          </w:tcPr>
-          <w:p>
-            <w:r>
-              <w:rPr>
-                <w:sz w:val="22"/>
-                <w:szCs w:val="22"/>
-              </w:rPr>
-              <w:t xml:space="preserve">2022</w:t>
-            </w:r>
-          </w:p>
-        </w:tc>
-        <w:tc>
-          <w:tcPr>
-            <w:tcW w:type="dxa" w:w="1900"/>
-            <w:tcBorders>
-              <w:top w:val="single" w:color="AAAAAA" w:sz="6"/>
-              <w:left w:val="single" w:color="AAAAAA" w:sz="6"/>
-              <w:bottom w:val="single" w:color="AAAAAA" w:sz="6"/>
-              <w:right w:val="single" w:color="AAAAAA" w:sz="6"/>
-            </w:tcBorders>
-            <w:shd w:fill="FFFFFF" w:val="clear"/>
-            <w:tcMar>
-              <w:top w:type="dxa" w:w="80"/>
-              <w:left w:type="dxa" w:w="140"/>
-              <w:bottom w:type="dxa" w:w="80"/>
-              <w:right w:type="dxa" w:w="140"/>
-            </w:tcMar>
-          </w:tcPr>
-          <w:p>
-            <w:r>
-              <w:rPr>
-                <w:sz w:val="22"/>
-                <w:szCs w:val="22"/>
-              </w:rPr>
-              <w:t xml:space="preserve">200만+</w:t>
-            </w:r>
-          </w:p>
-        </w:tc>
-        <w:tc>
-          <w:tcPr>
-            <w:tcW w:type="dxa" w:w="2160"/>
-            <w:tcBorders>
-              <w:top w:val="single" w:color="AAAAAA" w:sz="6"/>
-              <w:left w:val="single" w:color="AAAAAA" w:sz="6"/>
-              <w:bottom w:val="single" w:color="AAAAAA" w:sz="6"/>
-              <w:right w:val="single" w:color="AAAAAA" w:sz="6"/>
-            </w:tcBorders>
-            <w:shd w:fill="FFFFFF" w:val="clear"/>
-            <w:tcMar>
-              <w:top w:type="dxa" w:w="80"/>
-              <w:left w:type="dxa" w:w="140"/>
-              <w:bottom w:type="dxa" w:w="80"/>
-              <w:right w:type="dxa" w:w="140"/>
-            </w:tcMar>
-          </w:tcPr>
-          <w:p>
-            <w:r>
-              <w:rPr>
-                <w:sz w:val="22"/>
-                <w:szCs w:val="22"/>
-              </w:rPr>
-              <w:t xml:space="preserve">매우 긍정적</w:t>
-            </w:r>
-          </w:p>
-        </w:tc>
-      </w:tr>
-      <w:tr>
-        <w:tc>
-          <w:tcPr>
-            <w:tcW w:type="dxa" w:w="1900"/>
-            <w:tcBorders>
-              <w:top w:val="single" w:color="AAAAAA" w:sz="6"/>
-              <w:left w:val="single" w:color="AAAAAA" w:sz="6"/>
-              <w:bottom w:val="single" w:color="AAAAAA" w:sz="6"/>
-              <w:right w:val="single" w:color="AAAAAA" w:sz="6"/>
-            </w:tcBorders>
-            <w:shd w:fill="F8F4F0" w:val="clear"/>
-            <w:tcMar>
-              <w:top w:type="dxa" w:w="80"/>
-              <w:left w:type="dxa" w:w="140"/>
-              <w:bottom w:type="dxa" w:w="80"/>
-              <w:right w:type="dxa" w:w="140"/>
-            </w:tcMar>
-          </w:tcPr>
-          <w:p>
-            <w:r>
-              <w:rPr>
-                <w:sz w:val="22"/>
-                <w:szCs w:val="22"/>
-              </w:rPr>
-              <w:t xml:space="preserve">산나비 (Sanabi)</w:t>
-            </w:r>
-          </w:p>
-        </w:tc>
-        <w:tc>
-          <w:tcPr>
-            <w:tcW w:type="dxa" w:w="2200"/>
-            <w:tcBorders>
-              <w:top w:val="single" w:color="AAAAAA" w:sz="6"/>
-              <w:left w:val="single" w:color="AAAAAA" w:sz="6"/>
-              <w:bottom w:val="single" w:color="AAAAAA" w:sz="6"/>
-              <w:right w:val="single" w:color="AAAAAA" w:sz="6"/>
-            </w:tcBorders>
-            <w:shd w:fill="F8F4F0" w:val="clear"/>
-            <w:tcMar>
-              <w:top w:type="dxa" w:w="80"/>
-              <w:left w:type="dxa" w:w="140"/>
-              <w:bottom w:type="dxa" w:w="80"/>
-              <w:right w:type="dxa" w:w="140"/>
-            </w:tcMar>
-          </w:tcPr>
-          <w:p>
-            <w:r>
-              <w:rPr>
-                <w:sz w:val="22"/>
-                <w:szCs w:val="22"/>
-              </w:rPr>
-              <w:t xml:space="preserve">원더포션 (3인)</w:t>
-            </w:r>
-          </w:p>
-        </w:tc>
-        <w:tc>
-          <w:tcPr>
-            <w:tcW w:type="dxa" w:w="1200"/>
-            <w:tcBorders>
-              <w:top w:val="single" w:color="AAAAAA" w:sz="6"/>
-              <w:left w:val="single" w:color="AAAAAA" w:sz="6"/>
-              <w:bottom w:val="single" w:color="AAAAAA" w:sz="6"/>
-              <w:right w:val="single" w:color="AAAAAA" w:sz="6"/>
-            </w:tcBorders>
-            <w:shd w:fill="F8F4F0" w:val="clear"/>
-            <w:tcMar>
-              <w:top w:type="dxa" w:w="80"/>
-              <w:left w:type="dxa" w:w="140"/>
-              <w:bottom w:type="dxa" w:w="80"/>
-              <w:right w:type="dxa" w:w="140"/>
-            </w:tcMar>
-          </w:tcPr>
-          <w:p>
-            <w:r>
-              <w:rPr>
-                <w:sz w:val="22"/>
-                <w:szCs w:val="22"/>
-              </w:rPr>
-              <w:t xml:space="preserve">2023</w:t>
-            </w:r>
-          </w:p>
-        </w:tc>
-        <w:tc>
-          <w:tcPr>
-            <w:tcW w:type="dxa" w:w="1900"/>
-            <w:tcBorders>
-              <w:top w:val="single" w:color="AAAAAA" w:sz="6"/>
-              <w:left w:val="single" w:color="AAAAAA" w:sz="6"/>
-              <w:bottom w:val="single" w:color="AAAAAA" w:sz="6"/>
-              <w:right w:val="single" w:color="AAAAAA" w:sz="6"/>
-            </w:tcBorders>
-            <w:shd w:fill="F8F4F0" w:val="clear"/>
-            <w:tcMar>
-              <w:top w:type="dxa" w:w="80"/>
-              <w:left w:type="dxa" w:w="140"/>
-              <w:bottom w:type="dxa" w:w="80"/>
-              <w:right w:type="dxa" w:w="140"/>
-            </w:tcMar>
-          </w:tcPr>
-          <w:p>
-            <w:r>
-              <w:rPr>
-                <w:sz w:val="22"/>
-                <w:szCs w:val="22"/>
-              </w:rPr>
-              <w:t xml:space="preserve">100만+</w:t>
-            </w:r>
-          </w:p>
-        </w:tc>
-        <w:tc>
-          <w:tcPr>
-            <w:tcW w:type="dxa" w:w="2160"/>
-            <w:tcBorders>
-              <w:top w:val="single" w:color="AAAAAA" w:sz="6"/>
-              <w:left w:val="single" w:color="AAAAAA" w:sz="6"/>
-              <w:bottom w:val="single" w:color="AAAAAA" w:sz="6"/>
-              <w:right w:val="single" w:color="AAAAAA" w:sz="6"/>
-            </w:tcBorders>
-            <w:shd w:fill="F8F4F0" w:val="clear"/>
-            <w:tcMar>
-              <w:top w:type="dxa" w:w="80"/>
-              <w:left w:type="dxa" w:w="140"/>
-              <w:bottom w:type="dxa" w:w="80"/>
-              <w:right w:type="dxa" w:w="140"/>
-            </w:tcMar>
-          </w:tcPr>
-          <w:p>
-            <w:r>
-              <w:rPr>
-                <w:sz w:val="22"/>
-                <w:szCs w:val="22"/>
-              </w:rPr>
-              <w:t xml:space="preserve">매우 긍정적</w:t>
-            </w:r>
-          </w:p>
-        </w:tc>
-      </w:tr>
-      <w:tr>
-        <w:tc>
-          <w:tcPr>
-            <w:tcW w:type="dxa" w:w="1900"/>
-            <w:tcBorders>
-              <w:top w:val="single" w:color="AAAAAA" w:sz="6"/>
-              <w:left w:val="single" w:color="AAAAAA" w:sz="6"/>
-              <w:bottom w:val="single" w:color="AAAAAA" w:sz="6"/>
-              <w:right w:val="single" w:color="AAAAAA" w:sz="6"/>
-            </w:tcBorders>
-            <w:shd w:fill="FFFFFF" w:val="clear"/>
-            <w:tcMar>
-              <w:top w:type="dxa" w:w="80"/>
-              <w:left w:type="dxa" w:w="140"/>
-              <w:bottom w:type="dxa" w:w="80"/>
-              <w:right w:type="dxa" w:w="140"/>
-            </w:tcMar>
-          </w:tcPr>
-          <w:p>
-            <w:r>
-              <w:rPr>
-                <w:sz w:val="22"/>
-                <w:szCs w:val="22"/>
-              </w:rPr>
-              <w:t xml:space="preserve">Black Myth: Wukong</w:t>
-            </w:r>
-          </w:p>
-        </w:tc>
-        <w:tc>
-          <w:tcPr>
-            <w:tcW w:type="dxa" w:w="2200"/>
-            <w:tcBorders>
-              <w:top w:val="single" w:color="AAAAAA" w:sz="6"/>
-              <w:left w:val="single" w:color="AAAAAA" w:sz="6"/>
-              <w:bottom w:val="single" w:color="AAAAAA" w:sz="6"/>
-              <w:right w:val="single" w:color="AAAAAA" w:sz="6"/>
-            </w:tcBorders>
-            <w:shd w:fill="FFFFFF" w:val="clear"/>
-            <w:tcMar>
-              <w:top w:type="dxa" w:w="80"/>
-              <w:left w:type="dxa" w:w="140"/>
-              <w:bottom w:type="dxa" w:w="80"/>
-              <w:right w:type="dxa" w:w="140"/>
-            </w:tcMar>
-          </w:tcPr>
-          <w:p>
-            <w:r>
-              <w:rPr>
-                <w:sz w:val="22"/>
-                <w:szCs w:val="22"/>
-              </w:rPr>
-              <w:t xml:space="preserve">Game Science (140인)</w:t>
-            </w:r>
-          </w:p>
-        </w:tc>
-        <w:tc>
-          <w:tcPr>
-            <w:tcW w:type="dxa" w:w="1200"/>
-            <w:tcBorders>
-              <w:top w:val="single" w:color="AAAAAA" w:sz="6"/>
-              <w:left w:val="single" w:color="AAAAAA" w:sz="6"/>
-              <w:bottom w:val="single" w:color="AAAAAA" w:sz="6"/>
-              <w:right w:val="single" w:color="AAAAAA" w:sz="6"/>
-            </w:tcBorders>
-            <w:shd w:fill="FFFFFF" w:val="clear"/>
-            <w:tcMar>
-              <w:top w:type="dxa" w:w="80"/>
-              <w:left w:type="dxa" w:w="140"/>
-              <w:bottom w:type="dxa" w:w="80"/>
-              <w:right w:type="dxa" w:w="140"/>
-            </w:tcMar>
-          </w:tcPr>
-          <w:p>
-            <w:r>
-              <w:rPr>
-                <w:sz w:val="22"/>
-                <w:szCs w:val="22"/>
-              </w:rPr>
-              <w:t xml:space="preserve">2024</w:t>
-            </w:r>
-          </w:p>
-        </w:tc>
-        <w:tc>
-          <w:tcPr>
-            <w:tcW w:type="dxa" w:w="1900"/>
-            <w:tcBorders>
-              <w:top w:val="single" w:color="AAAAAA" w:sz="6"/>
-              <w:left w:val="single" w:color="AAAAAA" w:sz="6"/>
-              <w:bottom w:val="single" w:color="AAAAAA" w:sz="6"/>
-              <w:right w:val="single" w:color="AAAAAA" w:sz="6"/>
-            </w:tcBorders>
-            <w:shd w:fill="FFFFFF" w:val="clear"/>
-            <w:tcMar>
-              <w:top w:type="dxa" w:w="80"/>
-              <w:left w:type="dxa" w:w="140"/>
-              <w:bottom w:type="dxa" w:w="80"/>
-              <w:right w:type="dxa" w:w="140"/>
-            </w:tcMar>
-          </w:tcPr>
-          <w:p>
-            <w:r>
-              <w:rPr>
-                <w:sz w:val="22"/>
-                <w:szCs w:val="22"/>
-              </w:rPr>
-              <w:t xml:space="preserve">2,000만+ (1주)</w:t>
-            </w:r>
-          </w:p>
-        </w:tc>
-        <w:tc>
-          <w:tcPr>
-            <w:tcW w:type="dxa" w:w="2160"/>
-            <w:tcBorders>
-              <w:top w:val="single" w:color="AAAAAA" w:sz="6"/>
-              <w:left w:val="single" w:color="AAAAAA" w:sz="6"/>
-              <w:bottom w:val="single" w:color="AAAAAA" w:sz="6"/>
-              <w:right w:val="single" w:color="AAAAAA" w:sz="6"/>
-            </w:tcBorders>
-            <w:shd w:fill="FFFFFF" w:val="clear"/>
-            <w:tcMar>
-              <w:top w:type="dxa" w:w="80"/>
-              <w:left w:type="dxa" w:w="140"/>
-              <w:bottom w:type="dxa" w:w="80"/>
-              <w:right w:type="dxa" w:w="140"/>
-            </w:tcMar>
-          </w:tcPr>
-          <w:p>
-            <w:r>
-              <w:rPr>
-                <w:sz w:val="22"/>
-                <w:szCs w:val="22"/>
-              </w:rPr>
-              <w:t xml:space="preserve">압도적 긍정</w:t>
+        <w:trPr>
+          <w:cantSplit/>
+        </w:trPr>
+        <w:tc>
+          <w:tcPr>
+            <w:tcW w:type="dxa" w:w="1656"/>
+            <w:vAlign w:val="center"/>
+            <w:tcMar>
+              <w:top w:w="90" w:type="dxa"/>
+              <w:left w:w="90" w:type="dxa"/>
+              <w:bottom w:w="90" w:type="dxa"/>
+              <w:right w:w="90" w:type="dxa"/>
+            </w:tcMar>
+          </w:tcPr>
+          <w:p>
+            <w:pPr>
+              <w:spacing w:after="60" w:before="60" w:line="288" w:lineRule="auto"/>
+            </w:pPr>
+            <w:r>
+              <w:rPr>
+                <w:rFonts w:ascii="Malgun Gothic" w:hAnsi="Malgun Gothic" w:eastAsia="맑은 고딕"/>
+                <w:b w:val="0"/>
+                <w:color w:val="000000"/>
+                <w:sz w:val="20"/>
+              </w:rPr>
+              <w:t>사업화 방향</w:t>
+            </w:r>
+          </w:p>
+        </w:tc>
+        <w:tc>
+          <w:tcPr>
+            <w:tcW w:type="dxa" w:w="7416"/>
+            <w:vAlign w:val="center"/>
+            <w:tcMar>
+              <w:top w:w="90" w:type="dxa"/>
+              <w:left w:w="90" w:type="dxa"/>
+              <w:bottom w:w="90" w:type="dxa"/>
+              <w:right w:w="90" w:type="dxa"/>
+            </w:tcMar>
+          </w:tcPr>
+          <w:p>
+            <w:pPr>
+              <w:spacing w:after="60" w:before="60" w:line="288" w:lineRule="auto"/>
+            </w:pPr>
+            <w:r>
+              <w:rPr>
+                <w:rFonts w:ascii="Malgun Gothic" w:hAnsi="Malgun Gothic" w:eastAsia="맑은 고딕"/>
+                <w:b w:val="0"/>
+                <w:color w:val="000000"/>
+                <w:sz w:val="20"/>
+              </w:rPr>
+              <w:t>Steam 중심 글로벌 PC 유료 패키지. 가격·출시 범위·투자금은 별도 확정</w:t>
             </w:r>
           </w:p>
         </w:tc>
@@ -4284,135 +3456,36 @@
     </w:tbl>
     <w:p>
       <w:pPr>
-        <w:spacing w:after="100"/>
+        <w:keepNext w:val="0"/>
+        <w:pageBreakBefore w:val="0"/>
+        <w:spacing w:after="160" w:line="300" w:lineRule="auto"/>
       </w:pPr>
       <w:r>
-        <w:t xml:space="preserve"/>
+        <w:rPr>
+          <w:rFonts w:ascii="Malgun Gothic" w:hAnsi="Malgun Gothic" w:eastAsia="맑은 고딕"/>
+          <w:b w:val="0"/>
+          <w:color w:val="000000"/>
+          <w:sz w:val="21"/>
+        </w:rPr>
+        <w:t>핵심 고객에게 도달 → 데모로 경쟁력 검증 → 브랜드 정착 → 인접 ARPG 확장 순서로 진행한다. 국가·언어·기존 플레이 게임별 만족도, 가격 수용도, 구매 의향, 위시리스트·판매 전환, 재방문과 추천 의향을 확인한다. 시즌 일정과 반응을 보되 출시 품질 검증을 생략하지 않는다.</w:t>
       </w:r>
     </w:p>
-    <w:tbl>
-      <w:tblPr>
-        <w:tblW w:type="dxa" w:w="9360"/>
-        <w:tblBorders>
-          <w:top w:val="single" w:color="auto" w:sz="4"/>
-          <w:left w:val="single" w:color="auto" w:sz="4"/>
-          <w:bottom w:val="single" w:color="auto" w:sz="4"/>
-          <w:right w:val="single" w:color="auto" w:sz="4"/>
-          <w:insideH w:val="single" w:color="auto" w:sz="4"/>
-          <w:insideV w:val="single" w:color="auto" w:sz="4"/>
-        </w:tblBorders>
-      </w:tblPr>
-      <w:tblGrid>
-        <w:gridCol w:w="9360"/>
-      </w:tblGrid>
-      <w:tr>
-        <w:tc>
-          <w:tcPr>
-            <w:tcW w:type="dxa" w:w="9360"/>
-            <w:tcBorders>
-              <w:top w:val="single" w:color="8B0000" w:sz="12"/>
-              <w:left w:val="single" w:color="8B0000" w:sz="12"/>
-              <w:bottom w:val="single" w:color="8B0000" w:sz="12"/>
-              <w:right w:val="single" w:color="8B0000" w:sz="12"/>
-            </w:tcBorders>
-            <w:shd w:fill="FFF8F0" w:val="clear"/>
-            <w:tcMar>
-              <w:top w:type="dxa" w:w="160"/>
-              <w:left w:type="dxa" w:w="180"/>
-              <w:bottom w:type="dxa" w:w="160"/>
-              <w:right w:type="dxa" w:w="180"/>
-            </w:tcMar>
-          </w:tcPr>
-          <w:p>
-            <w:pPr>
-              <w:spacing w:after="100"/>
-            </w:pPr>
-            <w:r>
-              <w:rPr>
-                <w:b/>
-                <w:bCs/>
-                <w:color w:val="8B0000"/>
-                <w:sz w:val="22"/>
-                <w:szCs w:val="22"/>
-              </w:rPr>
-              <w:t xml:space="preserve">HELL EXODUSER에 적용 가능한 인사이트</w:t>
-            </w:r>
-          </w:p>
-          <w:p>
-            <w:pPr>
-              <w:spacing w:after="60"/>
-            </w:pPr>
-            <w:r>
-              <w:rPr>
-                <w:sz w:val="22"/>
-                <w:szCs w:val="22"/>
-              </w:rPr>
-              <w:t xml:space="preserve">1. Team Cherry 3인, Motion Twin 5인 등 소규모 팀이 글로벌 1000만 판매 달성. 1인 개발도 동일 경로 가능.</w:t>
-            </w:r>
-          </w:p>
-          <w:p>
-            <w:pPr>
-              <w:spacing w:after="60"/>
-            </w:pPr>
-            <w:r>
-              <w:rPr>
-                <w:sz w:val="22"/>
-                <w:szCs w:val="22"/>
-              </w:rPr>
-              <w:t xml:space="preserve">2. Hollow Knight도 출시 시점 콘텐츠 70%에서 EA, 무료 DLC 4회 추가로 "평생 가치" 구축.</w:t>
-            </w:r>
-          </w:p>
-          <w:p>
-            <w:pPr>
-              <w:spacing w:after="60"/>
-            </w:pPr>
-            <w:r>
-              <w:rPr>
-                <w:sz w:val="22"/>
-                <w:szCs w:val="22"/>
-              </w:rPr>
-              <w:t xml:space="preserve">3. Dead Cells의 "매번 다른 도전" + Hades의 "내러티브 + 핵슬" 조합 = HELL의 매스 러시 + 7챕터 폭로 서사.</w:t>
-            </w:r>
-          </w:p>
-          <w:p>
-            <w:pPr>
-              <w:spacing w:after="60"/>
-            </w:pPr>
-            <w:r>
-              <w:rPr>
-                <w:sz w:val="22"/>
-                <w:szCs w:val="22"/>
-              </w:rPr>
-              <w:t xml:space="preserve">4. 산나비는 한국 인디 ARPG 글로벌 성공 표준 사례. 네오위즈 퍼블리싱 + 글로벌 마케팅 = 100만 판매.</w:t>
-            </w:r>
-          </w:p>
-          <w:p>
-            <w:pPr>
-              <w:spacing w:after="60"/>
-            </w:pPr>
-            <w:r>
-              <w:rPr>
-                <w:sz w:val="22"/>
-                <w:szCs w:val="22"/>
-              </w:rPr>
-              <w:t xml:space="preserve">5. Black Myth: Wukong은 "보스 사연 누적 폭로" 구조의 매스 마켓 검증. HELL도 동일 구조 채택.</w:t>
-            </w:r>
-          </w:p>
-          <w:p>
-            <w:pPr>
-              <w:spacing w:after="60"/>
-            </w:pPr>
-            <w:r>
-              <w:rPr>
-                <w:sz w:val="22"/>
-                <w:szCs w:val="22"/>
-              </w:rPr>
-              <w:t xml:space="preserve">6. 평균가 $19.99~$24.99 인디 ARPG = 단품 가격대 표준. 페이월/DLC 강요 없이 단품으로도 1000만 판매 가능.</w:t>
-            </w:r>
-          </w:p>
-        </w:tc>
-      </w:tr>
-    </w:tbl>
+    <w:p>
+      <w:pPr>
+        <w:keepNext w:val="0"/>
+        <w:pageBreakBefore w:val="0"/>
+        <w:spacing w:after="160" w:line="300" w:lineRule="auto"/>
+      </w:pPr>
+      <w:r>
+        <w:rPr>
+          <w:rFonts w:ascii="Malgun Gothic" w:hAnsi="Malgun Gothic" w:eastAsia="맑은 고딕"/>
+          <w:b w:val="0"/>
+          <w:color w:val="000000"/>
+          <w:sz w:val="21"/>
+        </w:rPr>
+        <w:t>연령대와 구매력이 높은 고객층 및 MMORPG와 비슷한 시장 규모는 사용자가 제시한 시장 관점이다. 글로벌 성인층 공략과 ARPG 확장은 확정 전략이며, 실제 장르 연령 분포·평균 지출·MMORPG와의 규모 동등성은 검증할 가설이다. 핵앤슬래시와 ARPG의 중복 고객·시장 총액을 합산하지 않는다.</w:t>
+      </w:r>
+    </w:p>
     <w:p>
       <w:pPr>
         <w:pStyle w:val="Heading2"/>
@@ -5141,157 +4214,102 @@
     <w:p>
       <w:pPr>
         <w:pStyle w:val="Heading2"/>
-        <w:spacing w:after="160" w:before="280"/>
+        <w:keepNext/>
+        <w:pageBreakBefore w:val="0"/>
+        <w:spacing w:after="160" w:line="300" w:lineRule="auto"/>
       </w:pPr>
       <w:r>
         <w:rPr>
+          <w:rFonts w:ascii="Malgun Gothic" w:hAnsi="Malgun Gothic" w:eastAsia="맑은 고딕"/>
           <w:b/>
-          <w:bCs/>
-          <w:color w:val="2A2A2A"/>
-          <w:sz w:val="28"/>
-          <w:szCs w:val="28"/>
+          <w:color w:val="000000"/>
+          <w:sz w:val="24"/>
         </w:rPr>
-        <w:t xml:space="preserve">4.3 한국 인디 ARPG 성공 사례 - 산나비</w:t>
+        <w:t>4.3 상업성 근거와 해석 범위</w:t>
       </w:r>
     </w:p>
-    <w:tbl>
-      <w:tblPr>
-        <w:tblW w:type="dxa" w:w="9360"/>
-        <w:tblBorders>
-          <w:top w:val="single" w:color="auto" w:sz="4"/>
-          <w:left w:val="single" w:color="auto" w:sz="4"/>
-          <w:bottom w:val="single" w:color="auto" w:sz="4"/>
-          <w:right w:val="single" w:color="auto" w:sz="4"/>
-          <w:insideH w:val="single" w:color="auto" w:sz="4"/>
-          <w:insideV w:val="single" w:color="auto" w:sz="4"/>
-        </w:tblBorders>
-      </w:tblPr>
-      <w:tblGrid>
-        <w:gridCol w:w="9360"/>
-      </w:tblGrid>
-      <w:tr>
-        <w:tc>
-          <w:tcPr>
-            <w:tcW w:type="dxa" w:w="9360"/>
-            <w:tcBorders>
-              <w:top w:val="single" w:color="8B0000" w:sz="12"/>
-              <w:left w:val="single" w:color="8B0000" w:sz="12"/>
-              <w:bottom w:val="single" w:color="8B0000" w:sz="12"/>
-              <w:right w:val="single" w:color="8B0000" w:sz="12"/>
-            </w:tcBorders>
-            <w:shd w:fill="FFF8F0" w:val="clear"/>
-            <w:tcMar>
-              <w:top w:type="dxa" w:w="160"/>
-              <w:left w:type="dxa" w:w="180"/>
-              <w:bottom w:type="dxa" w:w="160"/>
-              <w:right w:type="dxa" w:w="180"/>
-            </w:tcMar>
-          </w:tcPr>
-          <w:p>
-            <w:pPr>
-              <w:spacing w:after="100"/>
-            </w:pPr>
-            <w:r>
-              <w:rPr>
-                <w:b/>
-                <w:bCs/>
-                <w:color w:val="8B0000"/>
-                <w:sz w:val="22"/>
-                <w:szCs w:val="22"/>
-              </w:rPr>
-              <w:t xml:space="preserve">산나비 (Sanabi, 원더포션) - 한국 인디 ARPG의 글로벌 성공 표준</w:t>
-            </w:r>
-          </w:p>
-          <w:p>
-            <w:pPr>
-              <w:spacing w:after="60"/>
-            </w:pPr>
-            <w:r>
-              <w:rPr>
-                <w:sz w:val="22"/>
-                <w:szCs w:val="22"/>
-              </w:rPr>
-              <w:t xml:space="preserve">개발사: 원더포션 (3인 팀)</w:t>
-            </w:r>
-          </w:p>
-          <w:p>
-            <w:pPr>
-              <w:spacing w:after="60"/>
-            </w:pPr>
-            <w:r>
-              <w:rPr>
-                <w:sz w:val="22"/>
-                <w:szCs w:val="22"/>
-              </w:rPr>
-              <w:t xml:space="preserve">출시: 2023.11 (Steam) → 2024 Switch · PS5 · Xbox</w:t>
-            </w:r>
-          </w:p>
-          <w:p>
-            <w:pPr>
-              <w:spacing w:after="60"/>
-            </w:pPr>
-            <w:r>
-              <w:rPr>
-                <w:sz w:val="22"/>
-                <w:szCs w:val="22"/>
-              </w:rPr>
-              <w:t xml:space="preserve">퍼블리셔: 네오위즈 (한국) + Maximum Entertainment (글로벌)</w:t>
-            </w:r>
-          </w:p>
-          <w:p>
-            <w:pPr>
-              <w:spacing w:after="60"/>
-            </w:pPr>
-            <w:r>
-              <w:rPr>
-                <w:sz w:val="22"/>
-                <w:szCs w:val="22"/>
-              </w:rPr>
-              <w:t xml:space="preserve">누적 판매: 100만+ (1년)</w:t>
-            </w:r>
-          </w:p>
-          <w:p>
-            <w:pPr>
-              <w:spacing w:after="60"/>
-            </w:pPr>
-            <w:r>
-              <w:rPr>
-                <w:sz w:val="22"/>
-                <w:szCs w:val="22"/>
-              </w:rPr>
-              <w:t xml:space="preserve">Steam 평점: 매우 긍정적 (95%+)</w:t>
-            </w:r>
-          </w:p>
-          <w:p>
-            <w:pPr>
-              <w:spacing w:after="60"/>
-            </w:pPr>
-            <w:r>
-              <w:rPr>
-                <w:sz w:val="22"/>
-                <w:szCs w:val="22"/>
-              </w:rPr>
-              <w:t xml:space="preserve">굿즈 크라우드펀딩: 14억 3,500만 원 (텀블벅, 한국 인디 게임 펀딩 최고 기록)</w:t>
-            </w:r>
-          </w:p>
-          <w:p>
-            <w:pPr>
-              <w:spacing w:after="60"/>
-            </w:pPr>
-            <w:r>
-              <w:rPr>
-                <w:sz w:val="22"/>
-                <w:szCs w:val="22"/>
-              </w:rPr>
-              <w:t xml:space="preserve">HELL EXODUSER 적용 포인트: 1) 네오위즈 퍼블리싱 모델 검증됨, 2) BIC 출품 이후 글로벌 진출 경로, 3) 굿즈 펀딩이 본편 매출과 별개 수익 채널 형성</w:t>
-            </w:r>
-          </w:p>
-        </w:tc>
-      </w:tr>
-    </w:tbl>
     <w:p>
+      <w:pPr>
+        <w:keepNext w:val="0"/>
+        <w:pageBreakBefore w:val="0"/>
+        <w:spacing w:after="160" w:line="300" w:lineRule="auto"/>
+      </w:pPr>
       <w:r>
-        <w:br w:type="page"/>
+        <w:rPr>
+          <w:rFonts w:ascii="Malgun Gothic" w:hAnsi="Malgun Gothic" w:eastAsia="맑은 고딕"/>
+          <w:b w:val="0"/>
+          <w:color w:val="000000"/>
+          <w:sz w:val="21"/>
+        </w:rPr>
+        <w:t>Diablo IV: 2023-06-12 공식 발표 기준, 출시 첫 5일 전 세계 PC·콘솔 소비자 판매액 6억 6,600만 달러 초과.</w:t>
+      </w:r>
+      <w:r>
+        <w:br/>
+      </w:r>
+      <w:r>
+        <w:rPr>
+          <w:rFonts w:ascii="Malgun Gothic" w:hAnsi="Malgun Gothic" w:eastAsia="맑은 고딕"/>
+          <w:b w:val="0"/>
+          <w:color w:val="000000"/>
+          <w:sz w:val="21"/>
+        </w:rPr>
+        <w:t>Last Epoch: 2024-02-09 개발사 공지 기준, 정식 1.0 출시 전 누적 100만 장 판매 달성.</w:t>
+      </w:r>
+    </w:p>
+    <w:p>
+      <w:pPr>
+        <w:keepNext w:val="0"/>
+        <w:pageBreakBefore w:val="0"/>
+        <w:spacing w:after="160" w:line="300" w:lineRule="auto"/>
+      </w:pPr>
+      <w:r>
+        <w:rPr>
+          <w:rFonts w:ascii="Malgun Gothic" w:hAnsi="Malgun Gothic" w:eastAsia="맑은 고딕"/>
+          <w:b w:val="0"/>
+          <w:color w:val="000000"/>
+          <w:sz w:val="21"/>
+        </w:rPr>
+        <w:t>개별 게임의 발표 당시 실적이다. 기간·단위가 다른 사례를 합산하거나 장르 전체 규모·연령별 지출·EXODUSER 예상 매출로 환산하지 않는다. 이전의 광범위한 인디 게임 성공 사례를 핵심 시장·예상 판매량의 근거로 삼는 도식은 이 절로 대체한다.</w:t>
+      </w:r>
+    </w:p>
+    <w:p>
+      <w:pPr>
+        <w:keepNext w:val="0"/>
+        <w:pageBreakBefore w:val="0"/>
+        <w:spacing w:after="160" w:line="300" w:lineRule="auto"/>
+      </w:pPr>
+      <w:r>
+        <w:rPr>
+          <w:rFonts w:ascii="Malgun Gothic" w:hAnsi="Malgun Gothic" w:eastAsia="맑은 고딕"/>
+          <w:b w:val="0"/>
+          <w:color w:val="000000"/>
+          <w:sz w:val="21"/>
+        </w:rPr>
+        <w:t>전체 기획 기준: docs/0마스터플랜/EXODUSER_PRODUCT_MARKET_STRATEGY.md</w:t>
+      </w:r>
+      <w:r>
+        <w:br/>
+      </w:r>
+      <w:r>
+        <w:rPr>
+          <w:rFonts w:ascii="Malgun Gothic" w:hAnsi="Malgun Gothic" w:eastAsia="맑은 고딕"/>
+          <w:b w:val="0"/>
+          <w:color w:val="000000"/>
+          <w:sz w:val="21"/>
+        </w:rPr>
+        <w:t>시장 근거: docs/13출시·마케팅/MARKET_EVIDENCE_20260930.md</w:t>
+      </w:r>
+      <w:r>
+        <w:br/>
+      </w:r>
+      <w:r>
+        <w:rPr>
+          <w:rFonts w:ascii="Malgun Gothic" w:hAnsi="Malgun Gothic" w:eastAsia="맑은 고딕"/>
+          <w:b w:val="0"/>
+          <w:color w:val="000000"/>
+          <w:sz w:val="21"/>
+        </w:rPr>
+        <w:t>고객 확보: docs/13출시·마케팅/시장포지셔닝_정통루팅ARPG.md</w:t>
       </w:r>
     </w:p>
     <w:p>
@@ -16888,7 +15906,7 @@
                 <w:sz w:val="22"/>
                 <w:szCs w:val="22"/>
               </w:rPr>
-              <w:t xml:space="preserve">HELL은 ARPG 코어 유저, DIROI는 캐주얼+모바일 유저 동시 확보</w:t>
+              <w:t>HELL은 글로벌 성인 핵앤슬래시 고객 확보 후 인접 ARPG로 확장. DIROI의 캐주얼·모바일 고객 전략은 별도 검증</w:t>
             </w:r>
           </w:p>
         </w:tc>
@@ -17159,6 +16177,54 @@
           <w:szCs w:val="36"/>
         </w:rPr>
         <w:t xml:space="preserve">11. 마케팅 전략</w:t>
+      </w:r>
+    </w:p>
+    <w:p>
+      <w:pPr>
+        <w:keepNext w:val="0"/>
+        <w:pageBreakBefore w:val="0"/>
+        <w:spacing w:after="160" w:line="300" w:lineRule="auto"/>
+      </w:pPr>
+      <w:r>
+        <w:rPr>
+          <w:rFonts w:ascii="Malgun Gothic" w:hAnsi="Malgun Gothic" w:eastAsia="맑은 고딕"/>
+          <w:b w:val="0"/>
+          <w:color w:val="000000"/>
+          <w:sz w:val="21"/>
+        </w:rPr>
+        <w:t>핵심 고객에게 도달 → 데모로 경쟁력 검증 → 브랜드 정착 → 인접 ARPG 확장 순서로 진행한다. 국가·언어·기존 플레이 게임별 만족도, 가격 수용도, 구매 의향, 위시리스트·판매 전환, 재방문과 추천 의향을 확인한다. 시즌 일정과 반응을 보되 출시 품질 검증을 생략하지 않는다.</w:t>
+      </w:r>
+    </w:p>
+    <w:p>
+      <w:pPr>
+        <w:keepNext w:val="0"/>
+        <w:pageBreakBefore w:val="0"/>
+        <w:spacing w:after="160" w:line="300" w:lineRule="auto"/>
+      </w:pPr>
+      <w:r>
+        <w:rPr>
+          <w:rFonts w:ascii="Malgun Gothic" w:hAnsi="Malgun Gothic" w:eastAsia="맑은 고딕"/>
+          <w:b w:val="0"/>
+          <w:color w:val="000000"/>
+          <w:sz w:val="21"/>
+        </w:rPr>
+        <w:t>고객: 글로벌 성인 핵앤슬래시층. 경쟁력: 루팅·빌드와 패링·기동 액션, 독자적 세계관. 확장: 브랜드 선호에 기반한 인접 ARPG 고객 확보.</w:t>
+      </w:r>
+    </w:p>
+    <w:p>
+      <w:pPr>
+        <w:keepNext w:val="0"/>
+        <w:pageBreakBefore w:val="0"/>
+        <w:spacing w:after="160" w:line="300" w:lineRule="auto"/>
+      </w:pPr>
+      <w:r>
+        <w:rPr>
+          <w:rFonts w:ascii="Malgun Gothic" w:hAnsi="Malgun Gothic" w:eastAsia="맑은 고딕"/>
+          <w:b w:val="0"/>
+          <w:color w:val="000000"/>
+          <w:sz w:val="21"/>
+        </w:rPr>
+        <w:t>아래 기존 채널별 예상 도달·수치 목표는 과거 기획 가정이며 현재 실적·검증된 장르 평균으로 인용하지 않는다.</w:t>
       </w:r>
     </w:p>
     <w:p>
@@ -17513,7 +16579,7 @@
                 <w:sz w:val="22"/>
                 <w:szCs w:val="22"/>
               </w:rPr>
-              <w:t xml:space="preserve">ARPG 코어, 다크판타지 팬</w:t>
+              <w:t>글로벌 핵앤슬래시 핵심층, 인접 ARPG 고객</w:t>
             </w:r>
           </w:p>
         </w:tc>
@@ -17816,7 +16882,7 @@
                 <w:sz w:val="22"/>
                 <w:szCs w:val="22"/>
               </w:rPr>
-              <w:t xml:space="preserve">r/IndieGaming, r/SoulsGames</w:t>
+              <w:t>핵앤슬래시 장르 커뮤니티와 크리에이터</w:t>
             </w:r>
           </w:p>
         </w:tc>
@@ -17843,7 +16909,7 @@
                 <w:sz w:val="22"/>
                 <w:szCs w:val="22"/>
               </w:rPr>
-              <w:t xml:space="preserve">다크 소울라이크 팬</w:t>
+              <w:t>디아블로·PoE·라스트 에폭 경험자</w:t>
             </w:r>
           </w:p>
         </w:tc>

</xml_diff>